<commit_message>
module 1.3 revised with git hub link and screen shot of git hub repository screenshot
</commit_message>
<xml_diff>
--- a/module-1/Bronson_Module_1_3_Programming Assignment.docx
+++ b/module-1/Bronson_Module_1_3_Programming Assignment.docx
@@ -45,6 +45,14 @@
       </w:r>
       <w:proofErr w:type="gramEnd"/>
     </w:p>
+    <w:p>
+      <w:pPr>
+        <w:jc w:val="center"/>
+      </w:pPr>
+      <w:r>
+        <w:t>https://github.com/Wendybronson/csd-402.git</w:t>
+      </w:r>
+    </w:p>
     <w:p/>
     <w:p/>
     <w:p>
@@ -77,6 +85,9 @@
     </w:p>
     <w:p>
       <w:r>
+        <w:rPr>
+          <w:noProof/>
+        </w:rPr>
         <w:drawing>
           <wp:inline distT="0" distB="0" distL="0" distR="0" wp14:anchorId="7B9F6313" wp14:editId="051B5E08">
             <wp:extent cx="5943600" cy="3150235"/>
@@ -116,6 +127,9 @@
     </w:p>
     <w:p>
       <w:r>
+        <w:rPr>
+          <w:noProof/>
+        </w:rPr>
         <w:lastRenderedPageBreak/>
         <w:drawing>
           <wp:inline distT="0" distB="0" distL="0" distR="0" wp14:anchorId="63D35C96" wp14:editId="6BCF646C">
@@ -156,6 +170,9 @@
     </w:p>
     <w:p>
       <w:r>
+        <w:rPr>
+          <w:noProof/>
+        </w:rPr>
         <w:drawing>
           <wp:inline distT="0" distB="0" distL="0" distR="0" wp14:anchorId="73008787" wp14:editId="7AF870D3">
             <wp:extent cx="5943600" cy="3404235"/>
@@ -195,6 +212,9 @@
     </w:p>
     <w:p>
       <w:r>
+        <w:rPr>
+          <w:noProof/>
+        </w:rPr>
         <w:lastRenderedPageBreak/>
         <w:drawing>
           <wp:inline distT="0" distB="0" distL="0" distR="0" wp14:anchorId="5437D432" wp14:editId="6704D2CA">
@@ -235,6 +255,9 @@
     </w:p>
     <w:p>
       <w:r>
+        <w:rPr>
+          <w:noProof/>
+        </w:rPr>
         <w:lastRenderedPageBreak/>
         <w:drawing>
           <wp:inline distT="0" distB="0" distL="0" distR="0" wp14:anchorId="2079447F" wp14:editId="561085FD">
@@ -306,6 +329,9 @@
     <w:p/>
     <w:p>
       <w:r>
+        <w:rPr>
+          <w:noProof/>
+        </w:rPr>
         <w:lastRenderedPageBreak/>
         <w:drawing>
           <wp:inline distT="0" distB="0" distL="0" distR="0" wp14:anchorId="66C18BF6" wp14:editId="2A233ED3">
@@ -344,8 +370,12 @@
         </w:drawing>
       </w:r>
     </w:p>
+    <w:p/>
     <w:p>
       <w:r>
+        <w:rPr>
+          <w:noProof/>
+        </w:rPr>
         <w:drawing>
           <wp:inline distT="0" distB="0" distL="0" distR="0" wp14:anchorId="56A96235" wp14:editId="3B29714F">
             <wp:extent cx="5306165" cy="2524477"/>
@@ -384,7 +414,46 @@
       </w:r>
     </w:p>
     <w:p/>
-    <w:p/>
+    <w:p>
+      <w:r>
+        <w:lastRenderedPageBreak/>
+        <w:drawing>
+          <wp:inline distT="0" distB="0" distL="0" distR="0" wp14:anchorId="104E1C95" wp14:editId="75B7B111">
+            <wp:extent cx="5943600" cy="2782570"/>
+            <wp:effectExtent l="0" t="0" r="0" b="0"/>
+            <wp:docPr id="1728935201" name="Picture 1"/>
+            <wp:cNvGraphicFramePr>
+              <a:graphicFrameLocks xmlns:a="http://schemas.openxmlformats.org/drawingml/2006/main" noChangeAspect="1"/>
+            </wp:cNvGraphicFramePr>
+            <a:graphic xmlns:a="http://schemas.openxmlformats.org/drawingml/2006/main">
+              <a:graphicData uri="http://schemas.openxmlformats.org/drawingml/2006/picture">
+                <pic:pic xmlns:pic="http://schemas.openxmlformats.org/drawingml/2006/picture">
+                  <pic:nvPicPr>
+                    <pic:cNvPr id="1728935201" name=""/>
+                    <pic:cNvPicPr/>
+                  </pic:nvPicPr>
+                  <pic:blipFill>
+                    <a:blip r:embed="rId11"/>
+                    <a:stretch>
+                      <a:fillRect/>
+                    </a:stretch>
+                  </pic:blipFill>
+                  <pic:spPr>
+                    <a:xfrm>
+                      <a:off x="0" y="0"/>
+                      <a:ext cx="5943600" cy="2782570"/>
+                    </a:xfrm>
+                    <a:prstGeom prst="rect">
+                      <a:avLst/>
+                    </a:prstGeom>
+                  </pic:spPr>
+                </pic:pic>
+              </a:graphicData>
+            </a:graphic>
+          </wp:inline>
+        </w:drawing>
+      </w:r>
+    </w:p>
     <w:sectPr>
       <w:pgSz w:w="12240" w:h="15840"/>
       <w:pgMar w:top="1440" w:right="1440" w:bottom="1440" w:left="1440" w:header="720" w:footer="720" w:gutter="0"/>
@@ -998,6 +1067,7 @@
   <w:style w:type="character" w:default="1" w:styleId="DefaultParagraphFont">
     <w:name w:val="Default Paragraph Font"/>
     <w:uiPriority w:val="1"/>
+    <w:semiHidden/>
     <w:unhideWhenUsed/>
   </w:style>
   <w:style w:type="table" w:default="1" w:styleId="TableNormal">

</xml_diff>